<commit_message>
Working on the tone of the essay with the reader
</commit_message>
<xml_diff>
--- a/scrolly/source_texts/uncanny_essay.docx
+++ b/scrolly/source_texts/uncanny_essay.docx
@@ -1,6 +1,6 @@
 
 <file path=word/document.xml><?xml version="1.0" encoding="utf-8"?>
-<w:document xmlns:wpc="http://schemas.microsoft.com/office/word/2010/wordprocessingCanvas" xmlns:cx="http://schemas.microsoft.com/office/drawing/2014/chartex" xmlns:cx1="http://schemas.microsoft.com/office/drawing/2015/9/8/chartex" xmlns:cx2="http://schemas.microsoft.com/office/drawing/2015/10/21/chartex" xmlns:cx3="http://schemas.microsoft.com/office/drawing/2016/5/9/chartex" xmlns:cx4="http://schemas.microsoft.com/office/drawing/2016/5/10/chartex" xmlns:cx5="http://schemas.microsoft.com/office/drawing/2016/5/11/chartex" xmlns:cx6="http://schemas.microsoft.com/office/drawing/2016/5/12/chartex" xmlns:cx7="http://schemas.microsoft.com/office/drawing/2016/5/13/chartex" xmlns:cx8="http://schemas.microsoft.com/office/drawing/2016/5/14/chartex" xmlns:mc="http://schemas.openxmlformats.org/markup-compatibility/2006" xmlns:aink="http://schemas.microsoft.com/office/drawing/2016/ink" xmlns:am3d="http://schemas.microsoft.com/office/drawing/2017/model3d" xmlns:o="urn:schemas-microsoft-com:office:office" xmlns:oel="http://schemas.microsoft.com/office/2019/extlst" xmlns:r="http://schemas.openxmlformats.org/officeDocument/2006/relationships" xmlns:m="http://schemas.openxmlformats.org/officeDocument/2006/math" xmlns:v="urn:schemas-microsoft-com:vml" xmlns:wp14="http://schemas.microsoft.com/office/word/2010/wordprocessingDrawing" xmlns:wp="http://schemas.openxmlformats.org/drawingml/2006/wordprocessingDrawing" xmlns:w10="urn:schemas-microsoft-com:office:word" xmlns:w="http://schemas.openxmlformats.org/wordprocessingml/2006/main" xmlns:w14="http://schemas.microsoft.com/office/word/2010/wordml" xmlns:w15="http://schemas.microsoft.com/office/word/2012/wordml" xmlns:w16cex="http://schemas.microsoft.com/office/word/2018/wordml/cex" xmlns:w16cid="http://schemas.microsoft.com/office/word/2016/wordml/cid" xmlns:w16="http://schemas.microsoft.com/office/word/2018/wordml" xmlns:w16du="http://schemas.microsoft.com/office/word/2023/wordml/word16du" xmlns:w16sdtdh="http://schemas.microsoft.com/office/word/2020/wordml/sdtdatahash" xmlns:w16se="http://schemas.microsoft.com/office/word/2015/wordml/symex" xmlns:wpg="http://schemas.microsoft.com/office/word/2010/wordprocessingGroup" xmlns:wpi="http://schemas.microsoft.com/office/word/2010/wordprocessingInk" xmlns:wne="http://schemas.microsoft.com/office/word/2006/wordml" xmlns:wps="http://schemas.microsoft.com/office/word/2010/wordprocessingShape" mc:Ignorable="w14 w15 w16se w16cid w16 w16cex w16sdtdh w16du wp14">
+<w:document xmlns:wpc="http://schemas.microsoft.com/office/word/2010/wordprocessingCanvas" xmlns:cx="http://schemas.microsoft.com/office/drawing/2014/chartex" xmlns:cx1="http://schemas.microsoft.com/office/drawing/2015/9/8/chartex" xmlns:cx2="http://schemas.microsoft.com/office/drawing/2015/10/21/chartex" xmlns:cx3="http://schemas.microsoft.com/office/drawing/2016/5/9/chartex" xmlns:cx4="http://schemas.microsoft.com/office/drawing/2016/5/10/chartex" xmlns:cx5="http://schemas.microsoft.com/office/drawing/2016/5/11/chartex" xmlns:cx6="http://schemas.microsoft.com/office/drawing/2016/5/12/chartex" xmlns:cx7="http://schemas.microsoft.com/office/drawing/2016/5/13/chartex" xmlns:cx8="http://schemas.microsoft.com/office/drawing/2016/5/14/chartex" xmlns:mc="http://schemas.openxmlformats.org/markup-compatibility/2006" xmlns:aink="http://schemas.microsoft.com/office/drawing/2016/ink" xmlns:am3d="http://schemas.microsoft.com/office/drawing/2017/model3d" xmlns:o="urn:schemas-microsoft-com:office:office" xmlns:oel="http://schemas.microsoft.com/office/2019/extlst" xmlns:r="http://schemas.openxmlformats.org/officeDocument/2006/relationships" xmlns:m="http://schemas.openxmlformats.org/officeDocument/2006/math" xmlns:v="urn:schemas-microsoft-com:vml" xmlns:wp14="http://schemas.microsoft.com/office/word/2010/wordprocessingDrawing" xmlns:wp="http://schemas.openxmlformats.org/drawingml/2006/wordprocessingDrawing" xmlns:w10="urn:schemas-microsoft-com:office:word" xmlns:w="http://schemas.openxmlformats.org/wordprocessingml/2006/main" xmlns:w14="http://schemas.microsoft.com/office/word/2010/wordml" xmlns:w15="http://schemas.microsoft.com/office/word/2012/wordml" xmlns:w16cex="http://schemas.microsoft.com/office/word/2018/wordml/cex" xmlns:w16cid="http://schemas.microsoft.com/office/word/2016/wordml/cid" xmlns:w16="http://schemas.microsoft.com/office/word/2018/wordml" xmlns:w16du="http://schemas.microsoft.com/office/word/2023/wordml/word16du" xmlns:w16sdtdh="http://schemas.microsoft.com/office/word/2020/wordml/sdtdatahash" xmlns:w16sdtfl="http://schemas.microsoft.com/office/word/2024/wordml/sdtformatlock" xmlns:w16se="http://schemas.microsoft.com/office/word/2015/wordml/symex" xmlns:wpg="http://schemas.microsoft.com/office/word/2010/wordprocessingGroup" xmlns:wpi="http://schemas.microsoft.com/office/word/2010/wordprocessingInk" xmlns:wne="http://schemas.microsoft.com/office/word/2006/wordml" xmlns:wps="http://schemas.microsoft.com/office/word/2010/wordprocessingShape" mc:Ignorable="w14 w15 w16se w16cid w16 w16cex w16sdtdh w16sdtfl w16du wp14">
   <w:body>
     <w:p>
       <w:pPr>
@@ -30,17 +30,8 @@
           <w:rFonts w:ascii="Times New Roman" w:hAnsi="Times New Roman"/>
           <w:lang w:val="it-IT"/>
         </w:rPr>
-        <w:t xml:space="preserve">Jay </w:t>
-      </w:r>
-      <w:proofErr w:type="spellStart"/>
-      <w:r>
-        <w:rPr>
-          <w:rFonts w:ascii="Times New Roman" w:hAnsi="Times New Roman"/>
-          <w:lang w:val="it-IT"/>
-        </w:rPr>
-        <w:t>Bolter</w:t>
-      </w:r>
-      <w:proofErr w:type="spellEnd"/>
+        <w:t>Jay Bolter</w:t>
+      </w:r>
       <w:r>
         <w:rPr>
           <w:rFonts w:ascii="Times New Roman" w:hAnsi="Times New Roman"/>
@@ -301,21 +292,12 @@
         </w:rPr>
         <w:t>“</w:t>
       </w:r>
-      <w:proofErr w:type="spellStart"/>
       <w:r>
         <w:rPr>
           <w:rFonts w:ascii="Times New Roman" w:hAnsi="Times New Roman"/>
           <w:lang w:val="nl-NL"/>
         </w:rPr>
-        <w:t>uncanny</w:t>
-      </w:r>
-      <w:proofErr w:type="spellEnd"/>
-      <w:r>
-        <w:rPr>
-          <w:rFonts w:ascii="Times New Roman" w:hAnsi="Times New Roman"/>
-          <w:lang w:val="nl-NL"/>
-        </w:rPr>
-        <w:t xml:space="preserve"> </w:t>
+        <w:t xml:space="preserve">uncanny </w:t>
       </w:r>
       <w:proofErr w:type="spellStart"/>
       <w:r>
@@ -795,18 +777,8 @@
           <w:i/>
           <w:iCs/>
         </w:rPr>
-        <w:t xml:space="preserve">Die </w:t>
-      </w:r>
-      <w:proofErr w:type="spellStart"/>
-      <w:r>
-        <w:rPr>
-          <w:rFonts w:ascii="Times New Roman" w:hAnsi="Times New Roman"/>
-          <w:i/>
-          <w:iCs/>
-        </w:rPr>
-        <w:t>Puppe</w:t>
-      </w:r>
-      <w:proofErr w:type="spellEnd"/>
+        <w:t>Die Puppe</w:t>
+      </w:r>
       <w:r>
         <w:rPr>
           <w:rFonts w:ascii="Times New Roman" w:hAnsi="Times New Roman"/>
@@ -874,21 +846,7 @@
         <w:rPr>
           <w:rFonts w:ascii="Times New Roman" w:hAnsi="Times New Roman"/>
         </w:rPr>
-        <w:t xml:space="preserve"> (1956) inspired three later versions (</w:t>
-      </w:r>
-      <w:proofErr w:type="spellStart"/>
-      <w:r>
-        <w:rPr>
-          <w:rFonts w:ascii="Times New Roman" w:hAnsi="Times New Roman"/>
-        </w:rPr>
-        <w:t>Loock</w:t>
-      </w:r>
-      <w:proofErr w:type="spellEnd"/>
-      <w:r>
-        <w:rPr>
-          <w:rFonts w:ascii="Times New Roman" w:hAnsi="Times New Roman"/>
-        </w:rPr>
-        <w:t>, 2012) as well as other films and TV series with similar themes. One of the most compelling recent supernatural double films is Jordan Peele</w:t>
+        <w:t xml:space="preserve"> (1956) inspired three later versions (Loock, 2012) as well as other films and TV series with similar themes. One of the most compelling recent supernatural double films is Jordan Peele</w:t>
       </w:r>
       <w:r>
         <w:rPr>
@@ -955,17 +913,14 @@
         </w:rPr>
         <w:t xml:space="preserve">, in </w:t>
       </w:r>
-      <w:proofErr w:type="spellStart"/>
-      <w:r>
-        <w:rPr>
-          <w:rFonts w:ascii="Times New Roman" w:hAnsi="Times New Roman"/>
-          <w:i/>
-          <w:iCs/>
-          <w:lang w:val="pt-PT"/>
+      <w:r>
+        <w:rPr>
+          <w:rFonts w:ascii="Times New Roman" w:hAnsi="Times New Roman"/>
+          <w:i/>
+          <w:iCs/>
         </w:rPr>
         <w:t>Vertigo</w:t>
       </w:r>
-      <w:proofErr w:type="spellEnd"/>
       <w:r>
         <w:rPr>
           <w:rFonts w:ascii="Times New Roman" w:hAnsi="Times New Roman"/>
@@ -1500,19 +1455,17 @@
         </w:rPr>
         <w:t xml:space="preserve"> effect. The myth is that film could </w:t>
       </w:r>
-      <w:proofErr w:type="gramStart"/>
-      <w:r>
-        <w:rPr>
-          <w:rFonts w:ascii="Times New Roman" w:hAnsi="Times New Roman"/>
-        </w:rPr>
-        <w:t>actually achieve</w:t>
-      </w:r>
-      <w:proofErr w:type="gramEnd"/>
-      <w:r>
-        <w:rPr>
-          <w:rFonts w:ascii="Times New Roman" w:hAnsi="Times New Roman"/>
-        </w:rPr>
-        <w:t xml:space="preserve"> the goal of reproducing the real, and in this sense neither the Lumi</w:t>
+      <w:r>
+        <w:rPr>
+          <w:rFonts w:ascii="Times New Roman" w:hAnsi="Times New Roman"/>
+        </w:rPr>
+        <w:t>indeed</w:t>
+      </w:r>
+      <w:r>
+        <w:rPr>
+          <w:rFonts w:ascii="Times New Roman" w:hAnsi="Times New Roman"/>
+        </w:rPr>
+        <w:t xml:space="preserve"> achieve the goal of reproducing the real, and in this sense neither the Lumi</w:t>
       </w:r>
       <w:r>
         <w:rPr>
@@ -1546,7 +1499,7 @@
           <w:rFonts w:ascii="Times New Roman" w:hAnsi="Times New Roman"/>
           <w:lang w:val="nl-NL"/>
         </w:rPr>
-        <w:t xml:space="preserve"> </w:t>
+        <w:t xml:space="preserve"> uncanny </w:t>
       </w:r>
       <w:proofErr w:type="spellStart"/>
       <w:r>
@@ -1554,43 +1507,27 @@
           <w:rFonts w:ascii="Times New Roman" w:hAnsi="Times New Roman"/>
           <w:lang w:val="nl-NL"/>
         </w:rPr>
-        <w:t>uncanny</w:t>
+        <w:t>valley</w:t>
       </w:r>
       <w:proofErr w:type="spellEnd"/>
       <w:r>
         <w:rPr>
           <w:rFonts w:ascii="Times New Roman" w:hAnsi="Times New Roman"/>
-          <w:lang w:val="nl-NL"/>
-        </w:rPr>
-        <w:t xml:space="preserve"> </w:t>
+        </w:rPr>
+        <w:t xml:space="preserve">. In fact, we would argue that the La </w:t>
       </w:r>
       <w:proofErr w:type="spellStart"/>
       <w:r>
         <w:rPr>
           <w:rFonts w:ascii="Times New Roman" w:hAnsi="Times New Roman"/>
-          <w:lang w:val="nl-NL"/>
-        </w:rPr>
-        <w:t>valley</w:t>
+        </w:rPr>
+        <w:t>Ciotat</w:t>
       </w:r>
       <w:proofErr w:type="spellEnd"/>
       <w:r>
         <w:rPr>
           <w:rFonts w:ascii="Times New Roman" w:hAnsi="Times New Roman"/>
         </w:rPr>
-        <w:t xml:space="preserve">. In fact, we would argue that the La </w:t>
-      </w:r>
-      <w:proofErr w:type="spellStart"/>
-      <w:r>
-        <w:rPr>
-          <w:rFonts w:ascii="Times New Roman" w:hAnsi="Times New Roman"/>
-        </w:rPr>
-        <w:t>Ciotat</w:t>
-      </w:r>
-      <w:proofErr w:type="spellEnd"/>
-      <w:r>
-        <w:rPr>
-          <w:rFonts w:ascii="Times New Roman" w:hAnsi="Times New Roman"/>
-        </w:rPr>
         <w:t xml:space="preserve"> effect is essential to film but that the effect could hardly exist without the myth that lies behind it. Even in the twenty-first century, the dominant rhetoric of mainstream or Hollywood film is that it can or might someday be able to close the gap. </w:t>
       </w:r>
     </w:p>
@@ -1606,21 +1543,7 @@
         <w:rPr>
           <w:rFonts w:ascii="Times New Roman" w:hAnsi="Times New Roman"/>
         </w:rPr>
-        <w:t xml:space="preserve">In recent decades film theorists and historians have been analyzing how filmmaking and spectatorship have diverged from the classic models of the twentieth century. Steven Shapiro, for example, has argued that action films in the 2000s are often characterized by a “post-continuity style, a preoccupation with immediate effects trumps any concern for broader continuity—whether on the immediate shot-by-shot level, or on that of the overall narrative” (Shapiro 2016 p. 51). Denison &amp; </w:t>
-      </w:r>
-      <w:proofErr w:type="spellStart"/>
-      <w:r>
-        <w:rPr>
-          <w:rFonts w:ascii="Times New Roman" w:hAnsi="Times New Roman"/>
-        </w:rPr>
-        <w:t>Leyda</w:t>
-      </w:r>
-      <w:proofErr w:type="spellEnd"/>
-      <w:r>
-        <w:rPr>
-          <w:rFonts w:ascii="Times New Roman" w:hAnsi="Times New Roman"/>
-        </w:rPr>
-        <w:t xml:space="preserve"> (2016), in the volume </w:t>
+        <w:t xml:space="preserve">In recent decades film theorists and historians have been analyzing how filmmaking and spectatorship have diverged from the classic models of the twentieth century. Steven Shapiro, for example, has argued that action films in the 2000s are often characterized by a “post-continuity style, a preoccupation with immediate effects trumps any concern for broader continuity—whether on the immediate shot-by-shot level, or on that of the overall narrative” (Shapiro 2016 p. 51). Denison &amp; Leyda (2016), in the volume </w:t>
       </w:r>
       <w:r>
         <w:rPr>
@@ -1778,16 +1701,8 @@
         <w:rPr>
           <w:rFonts w:ascii="Times New Roman" w:hAnsi="Times New Roman"/>
         </w:rPr>
-        <w:t xml:space="preserve"> but the technique of the photographer can fashion or diminish the aura of the result. He points to the architectural photographer </w:t>
-      </w:r>
-      <w:proofErr w:type="spellStart"/>
-      <w:r>
-        <w:rPr>
-          <w:rFonts w:ascii="Times New Roman" w:hAnsi="Times New Roman"/>
-        </w:rPr>
-        <w:t>Eug</w:t>
-      </w:r>
-      <w:proofErr w:type="spellEnd"/>
+        <w:t xml:space="preserve"> but the technique of the photographer can fashion or diminish the aura of the result. He points to the architectural photographer Eug</w:t>
+      </w:r>
       <w:r>
         <w:rPr>
           <w:rFonts w:ascii="Times New Roman" w:hAnsi="Times New Roman"/>
@@ -2517,17 +2432,14 @@
         </w:rPr>
         <w:t xml:space="preserve">s job is to find a rational explanation, typically by uncovering a hidden truth, and in that sense, the Freudian psychoanalyst is also a detective. </w:t>
       </w:r>
-      <w:proofErr w:type="spellStart"/>
-      <w:r>
-        <w:rPr>
-          <w:rFonts w:ascii="Times New Roman" w:hAnsi="Times New Roman"/>
-          <w:i/>
-          <w:iCs/>
-          <w:lang w:val="pt-PT"/>
+      <w:r>
+        <w:rPr>
+          <w:rFonts w:ascii="Times New Roman" w:hAnsi="Times New Roman"/>
+          <w:i/>
+          <w:iCs/>
         </w:rPr>
         <w:t>Vertigo</w:t>
       </w:r>
-      <w:proofErr w:type="spellEnd"/>
       <w:r>
         <w:rPr>
           <w:rFonts w:ascii="Times New Roman" w:hAnsi="Times New Roman"/>
@@ -2639,19 +2551,8 @@
           <w:iCs/>
           <w:lang w:val="fr-FR"/>
         </w:rPr>
-        <w:t xml:space="preserve"> </w:t>
-      </w:r>
-      <w:proofErr w:type="spellStart"/>
-      <w:r>
-        <w:rPr>
-          <w:rFonts w:ascii="Times New Roman" w:hAnsi="Times New Roman"/>
-          <w:i/>
-          <w:iCs/>
-          <w:lang w:val="fr-FR"/>
-        </w:rPr>
-        <w:t>Evil</w:t>
-      </w:r>
-      <w:proofErr w:type="spellEnd"/>
+        <w:t xml:space="preserve"> Evil</w:t>
+      </w:r>
       <w:r>
         <w:rPr>
           <w:rFonts w:ascii="Times New Roman" w:hAnsi="Times New Roman"/>
@@ -2692,7 +2593,21 @@
         <w:rPr>
           <w:rFonts w:ascii="Times New Roman" w:hAnsi="Times New Roman"/>
         </w:rPr>
-        <w:t xml:space="preserve"> all the more adamantly on film</w:t>
+        <w:t xml:space="preserve"> </w:t>
+      </w:r>
+      <w:proofErr w:type="gramStart"/>
+      <w:r>
+        <w:rPr>
+          <w:rFonts w:ascii="Times New Roman" w:hAnsi="Times New Roman"/>
+        </w:rPr>
+        <w:t>all the more</w:t>
+      </w:r>
+      <w:proofErr w:type="gramEnd"/>
+      <w:r>
+        <w:rPr>
+          <w:rFonts w:ascii="Times New Roman" w:hAnsi="Times New Roman"/>
+        </w:rPr>
+        <w:t xml:space="preserve"> adamantly on film</w:t>
       </w:r>
       <w:r>
         <w:rPr>
@@ -3192,35 +3107,7 @@
           <w:rFonts w:ascii="Times New Roman" w:hAnsi="Times New Roman"/>
         </w:rPr>
         <w:lastRenderedPageBreak/>
-        <w:t xml:space="preserve">This essay, like some others in this collection, argues that CG and VR should be understood as belonging to and remediating the representational practices of live-action film. In his compelling essay opening this section of this volume, however, William </w:t>
-      </w:r>
-      <w:proofErr w:type="spellStart"/>
-      <w:r>
-        <w:rPr>
-          <w:rFonts w:ascii="Times New Roman" w:hAnsi="Times New Roman"/>
-        </w:rPr>
-        <w:t>Uricchio</w:t>
-      </w:r>
-      <w:proofErr w:type="spellEnd"/>
-      <w:r>
-        <w:rPr>
-          <w:rFonts w:ascii="Times New Roman" w:hAnsi="Times New Roman"/>
-        </w:rPr>
-        <w:t xml:space="preserve"> suggests that VR is antithetical to cinema in its "visual constructions, organization of time, and possibilities of story.” </w:t>
-      </w:r>
-      <w:proofErr w:type="spellStart"/>
-      <w:r>
-        <w:rPr>
-          <w:rFonts w:ascii="Times New Roman" w:hAnsi="Times New Roman"/>
-        </w:rPr>
-        <w:t>Uricchio’s</w:t>
-      </w:r>
-      <w:proofErr w:type="spellEnd"/>
-      <w:r>
-        <w:rPr>
-          <w:rFonts w:ascii="Times New Roman" w:hAnsi="Times New Roman"/>
-        </w:rPr>
-        <w:t xml:space="preserve"> insights are valuable, and, we would argue, do not necessarily contradict the quality of CG and VR that most closely connects them to film: their ambivalent and uncanny claim to capture reality. CG and VR</w:t>
+        <w:t>This essay, like some others in this collection, argues that CG and VR should be understood as belonging to and remediating the representational practices of live-action film. In his compelling essay opening this section of this volume, however, William Uricchio suggests that VR is antithetical to cinema in its "visual constructions, organization of time, and possibilities of story.” Uricchio’s insights are valuable, and, we would argue, do not necessarily contradict the quality of CG and VR that most closely connects them to film: their ambivalent and uncanny claim to capture reality. CG and VR</w:t>
       </w:r>
       <w:r>
         <w:rPr>
@@ -3601,21 +3488,7 @@
         <w:rPr>
           <w:rFonts w:ascii="Times New Roman" w:hAnsi="Times New Roman"/>
         </w:rPr>
-        <w:t xml:space="preserve">Bolter, Jay David, Blair </w:t>
-      </w:r>
-      <w:proofErr w:type="spellStart"/>
-      <w:r>
-        <w:rPr>
-          <w:rFonts w:ascii="Times New Roman" w:hAnsi="Times New Roman"/>
-        </w:rPr>
-        <w:t>MacIntyre</w:t>
-      </w:r>
-      <w:proofErr w:type="spellEnd"/>
-      <w:r>
-        <w:rPr>
-          <w:rFonts w:ascii="Times New Roman" w:hAnsi="Times New Roman"/>
-        </w:rPr>
-        <w:t xml:space="preserve">, Maribeth Gandy, and Petra Schweitzer. 2006. </w:t>
+        <w:t xml:space="preserve">Bolter, Jay David, Blair MacIntyre, Maribeth Gandy, and Petra Schweitzer. 2006. </w:t>
       </w:r>
       <w:r>
         <w:rPr>
@@ -3693,23 +3566,7 @@
           <w:rStyle w:val="PageNumber"/>
           <w:rFonts w:eastAsia="Arial Unicode MS" w:cs="Arial Unicode MS"/>
         </w:rPr>
-        <w:t xml:space="preserve">Bolter, Jay David, Maria Engberg, and Blair </w:t>
-      </w:r>
-      <w:proofErr w:type="spellStart"/>
-      <w:r>
-        <w:rPr>
-          <w:rStyle w:val="PageNumber"/>
-          <w:rFonts w:eastAsia="Arial Unicode MS" w:cs="Arial Unicode MS"/>
-        </w:rPr>
-        <w:t>MacIntyre</w:t>
-      </w:r>
-      <w:proofErr w:type="spellEnd"/>
-      <w:r>
-        <w:rPr>
-          <w:rStyle w:val="PageNumber"/>
-          <w:rFonts w:eastAsia="Arial Unicode MS" w:cs="Arial Unicode MS"/>
-        </w:rPr>
-        <w:t xml:space="preserve">. 2021. </w:t>
+        <w:t xml:space="preserve">Bolter, Jay David, Maria Engberg, and Blair MacIntyre. 2021. </w:t>
       </w:r>
       <w:r>
         <w:rPr>
@@ -3804,23 +3661,7 @@
           <w:rFonts w:ascii="Times New Roman" w:hAnsi="Times New Roman"/>
         </w:rPr>
         <w:lastRenderedPageBreak/>
-        <w:t xml:space="preserve">Denson, S., &amp; </w:t>
-      </w:r>
-      <w:proofErr w:type="spellStart"/>
-      <w:r>
-        <w:rPr>
-          <w:rStyle w:val="None"/>
-          <w:rFonts w:ascii="Times New Roman" w:hAnsi="Times New Roman"/>
-        </w:rPr>
-        <w:t>Leyda</w:t>
-      </w:r>
-      <w:proofErr w:type="spellEnd"/>
-      <w:r>
-        <w:rPr>
-          <w:rStyle w:val="None"/>
-          <w:rFonts w:ascii="Times New Roman" w:hAnsi="Times New Roman"/>
-        </w:rPr>
-        <w:t xml:space="preserve">, J. (Eds.). (2016). </w:t>
+        <w:t xml:space="preserve">Denson, S., &amp; Leyda, J. (Eds.). (2016). </w:t>
       </w:r>
       <w:r>
         <w:rPr>
@@ -3864,25 +3705,7 @@
           <w:rFonts w:ascii="Times New Roman" w:hAnsi="Times New Roman"/>
           <w:lang w:val="de-DE"/>
         </w:rPr>
-        <w:t xml:space="preserve">Diel, Alexander, Sarah Weigelt, and Karl F. </w:t>
-      </w:r>
-      <w:proofErr w:type="spellStart"/>
-      <w:r>
-        <w:rPr>
-          <w:rStyle w:val="None"/>
-          <w:rFonts w:ascii="Times New Roman" w:hAnsi="Times New Roman"/>
-          <w:lang w:val="de-DE"/>
-        </w:rPr>
-        <w:t>Macdorman</w:t>
-      </w:r>
-      <w:proofErr w:type="spellEnd"/>
-      <w:r>
-        <w:rPr>
-          <w:rStyle w:val="None"/>
-          <w:rFonts w:ascii="Times New Roman" w:hAnsi="Times New Roman"/>
-          <w:lang w:val="de-DE"/>
-        </w:rPr>
-        <w:t xml:space="preserve">. </w:t>
+        <w:t xml:space="preserve">Diel, Alexander, Sarah Weigelt, and Karl F. Macdorman. </w:t>
       </w:r>
       <w:r>
         <w:rPr>
@@ -3954,7 +3777,39 @@
           <w:rStyle w:val="Hyperlink0"/>
           <w:rFonts w:eastAsia="Arial Unicode MS"/>
         </w:rPr>
-        <w:t xml:space="preserve"> 1:1-1:33.</w:t>
+        <w:t xml:space="preserve"> </w:t>
+      </w:r>
+      <w:proofErr w:type="gramStart"/>
+      <w:r>
+        <w:rPr>
+          <w:rStyle w:val="Hyperlink0"/>
+          <w:rFonts w:eastAsia="Arial Unicode MS"/>
+        </w:rPr>
+        <w:t>1:</w:t>
+      </w:r>
+      <w:proofErr w:type="gramEnd"/>
+      <w:r>
+        <w:rPr>
+          <w:rStyle w:val="Hyperlink0"/>
+          <w:rFonts w:eastAsia="Arial Unicode MS"/>
+        </w:rPr>
+        <w:t>1-</w:t>
+      </w:r>
+      <w:proofErr w:type="gramStart"/>
+      <w:r>
+        <w:rPr>
+          <w:rStyle w:val="Hyperlink0"/>
+          <w:rFonts w:eastAsia="Arial Unicode MS"/>
+        </w:rPr>
+        <w:t>1:</w:t>
+      </w:r>
+      <w:proofErr w:type="gramEnd"/>
+      <w:r>
+        <w:rPr>
+          <w:rStyle w:val="Hyperlink0"/>
+          <w:rFonts w:eastAsia="Arial Unicode MS"/>
+        </w:rPr>
+        <w:t>33.</w:t>
       </w:r>
       <w:hyperlink r:id="rId10" w:history="1">
         <w:r>
@@ -4011,7 +3866,6 @@
         <w:rPr>
           <w:rStyle w:val="None"/>
           <w:rFonts w:ascii="Times New Roman" w:hAnsi="Times New Roman"/>
-          <w:lang w:val="pt-PT"/>
         </w:rPr>
         <w:t xml:space="preserve"> Trans.). </w:t>
       </w:r>
@@ -4142,21 +3996,7 @@
         <w:rPr>
           <w:rStyle w:val="PageNumber"/>
         </w:rPr>
-        <w:t xml:space="preserve">Grusin, Richard. 2016. DVDs, Video Games, and the Cinema of Interactions. In S. Denison &amp; J. </w:t>
-      </w:r>
-      <w:proofErr w:type="spellStart"/>
-      <w:r>
-        <w:rPr>
-          <w:rStyle w:val="PageNumber"/>
-        </w:rPr>
-        <w:t>Leyda</w:t>
-      </w:r>
-      <w:proofErr w:type="spellEnd"/>
-      <w:r>
-        <w:rPr>
-          <w:rStyle w:val="PageNumber"/>
-        </w:rPr>
-        <w:t xml:space="preserve"> (Eds.), </w:t>
+        <w:t xml:space="preserve">Grusin, Richard. 2016. DVDs, Video Games, and the Cinema of Interactions. In S. Denison &amp; J. Leyda (Eds.), </w:t>
       </w:r>
       <w:r>
         <w:rPr>
@@ -4459,41 +4299,12 @@
         </w:rPr>
         <w:t>“</w:t>
       </w:r>
-      <w:proofErr w:type="spellStart"/>
-      <w:r>
-        <w:rPr>
-          <w:rStyle w:val="None"/>
-          <w:rFonts w:ascii="Times New Roman" w:hAnsi="Times New Roman"/>
-          <w:lang w:val="pt-PT"/>
-        </w:rPr>
-        <w:t>Uncanny</w:t>
-      </w:r>
-      <w:proofErr w:type="spellEnd"/>
-      <w:r>
-        <w:rPr>
-          <w:rStyle w:val="None"/>
-          <w:rFonts w:ascii="Times New Roman" w:hAnsi="Times New Roman"/>
-          <w:lang w:val="pt-PT"/>
-        </w:rPr>
-        <w:t xml:space="preserve"> </w:t>
-      </w:r>
-      <w:proofErr w:type="spellStart"/>
-      <w:r>
-        <w:rPr>
-          <w:rStyle w:val="None"/>
-          <w:rFonts w:ascii="Times New Roman" w:hAnsi="Times New Roman"/>
-          <w:lang w:val="pt-PT"/>
-        </w:rPr>
-        <w:t>Presences</w:t>
-      </w:r>
-      <w:proofErr w:type="spellEnd"/>
-      <w:r>
-        <w:rPr>
-          <w:rStyle w:val="None"/>
-          <w:rFonts w:ascii="Times New Roman" w:hAnsi="Times New Roman"/>
-          <w:lang w:val="pt-PT"/>
-        </w:rPr>
-        <w:t>.</w:t>
+      <w:r>
+        <w:rPr>
+          <w:rStyle w:val="None"/>
+          <w:rFonts w:ascii="Times New Roman" w:hAnsi="Times New Roman"/>
+        </w:rPr>
+        <w:t>Uncanny Presences.</w:t>
       </w:r>
       <w:r>
         <w:rPr>
@@ -4616,21 +4427,7 @@
         <w:rPr>
           <w:rStyle w:val="PageNumber"/>
         </w:rPr>
-        <w:t xml:space="preserve">, M., &amp; </w:t>
-      </w:r>
-      <w:proofErr w:type="spellStart"/>
-      <w:r>
-        <w:rPr>
-          <w:rStyle w:val="PageNumber"/>
-        </w:rPr>
-        <w:t>Takala</w:t>
-      </w:r>
-      <w:proofErr w:type="spellEnd"/>
-      <w:r>
-        <w:rPr>
-          <w:rStyle w:val="PageNumber"/>
-        </w:rPr>
-        <w:t xml:space="preserve">, T. (2015). A review of empirical evidence on different uncanny valley hypotheses: Support for perceptual mismatch as one road to the valley of eeriness. </w:t>
+        <w:t xml:space="preserve">, M., &amp; Takala, T. (2015). A review of empirical evidence on different uncanny valley hypotheses: Support for perceptual mismatch as one road to the valley of eeriness. </w:t>
       </w:r>
       <w:r>
         <w:rPr>
@@ -4749,85 +4546,44 @@
           <w:rFonts w:ascii="Times New Roman" w:eastAsia="Times New Roman" w:hAnsi="Times New Roman" w:cs="Times New Roman"/>
         </w:rPr>
       </w:pPr>
-      <w:proofErr w:type="spellStart"/>
       <w:r>
         <w:rPr>
           <w:rStyle w:val="Hyperlink0"/>
           <w:rFonts w:eastAsia="Arial Unicode MS"/>
         </w:rPr>
-        <w:t>Loock</w:t>
-      </w:r>
-      <w:proofErr w:type="spellEnd"/>
+        <w:t xml:space="preserve">Loock, Kathleen. 2012. </w:t>
+      </w:r>
+      <w:r>
+        <w:rPr>
+          <w:rStyle w:val="None"/>
+          <w:rFonts w:ascii="Times New Roman" w:hAnsi="Times New Roman"/>
+          <w:rtl/>
+          <w:lang w:val="ar-SA"/>
+        </w:rPr>
+        <w:t>“</w:t>
+      </w:r>
       <w:r>
         <w:rPr>
           <w:rStyle w:val="Hyperlink0"/>
           <w:rFonts w:eastAsia="Arial Unicode MS"/>
         </w:rPr>
-        <w:t xml:space="preserve">, Kathleen. 2012. </w:t>
-      </w:r>
-      <w:r>
-        <w:rPr>
-          <w:rStyle w:val="None"/>
-          <w:rFonts w:ascii="Times New Roman" w:hAnsi="Times New Roman"/>
-          <w:rtl/>
-          <w:lang w:val="ar-SA"/>
-        </w:rPr>
-        <w:t>“</w:t>
+        <w:t xml:space="preserve">The Return of the Pod People: Remaking Cultural Anxieties in Invasion of the Body Snatchers.” In </w:t>
+      </w:r>
+      <w:r>
+        <w:rPr>
+          <w:rStyle w:val="None"/>
+          <w:rFonts w:ascii="Times New Roman" w:hAnsi="Times New Roman"/>
+          <w:i/>
+          <w:iCs/>
+        </w:rPr>
+        <w:t>Film Remakes, Adaptations and Fan Productions</w:t>
       </w:r>
       <w:r>
         <w:rPr>
           <w:rStyle w:val="Hyperlink0"/>
           <w:rFonts w:eastAsia="Arial Unicode MS"/>
         </w:rPr>
-        <w:t xml:space="preserve">The Return of the Pod People: Remaking Cultural Anxieties in Invasion of the Body Snatchers.” In </w:t>
-      </w:r>
-      <w:r>
-        <w:rPr>
-          <w:rStyle w:val="None"/>
-          <w:rFonts w:ascii="Times New Roman" w:hAnsi="Times New Roman"/>
-          <w:i/>
-          <w:iCs/>
-        </w:rPr>
-        <w:t>Film Remakes, Adaptations and Fan Productions</w:t>
-      </w:r>
-      <w:r>
-        <w:rPr>
-          <w:rStyle w:val="Hyperlink0"/>
-          <w:rFonts w:eastAsia="Arial Unicode MS"/>
-        </w:rPr>
-        <w:t xml:space="preserve">, edited by Kathleen </w:t>
-      </w:r>
-      <w:proofErr w:type="spellStart"/>
-      <w:r>
-        <w:rPr>
-          <w:rStyle w:val="Hyperlink0"/>
-          <w:rFonts w:eastAsia="Arial Unicode MS"/>
-        </w:rPr>
-        <w:t>Loock</w:t>
-      </w:r>
-      <w:proofErr w:type="spellEnd"/>
-      <w:r>
-        <w:rPr>
-          <w:rStyle w:val="Hyperlink0"/>
-          <w:rFonts w:eastAsia="Arial Unicode MS"/>
-        </w:rPr>
-        <w:t xml:space="preserve"> and Constantine </w:t>
-      </w:r>
-      <w:proofErr w:type="spellStart"/>
-      <w:r>
-        <w:rPr>
-          <w:rStyle w:val="Hyperlink0"/>
-          <w:rFonts w:eastAsia="Arial Unicode MS"/>
-        </w:rPr>
-        <w:t>Verevis</w:t>
-      </w:r>
-      <w:proofErr w:type="spellEnd"/>
-      <w:r>
-        <w:rPr>
-          <w:rStyle w:val="Hyperlink0"/>
-          <w:rFonts w:eastAsia="Arial Unicode MS"/>
-        </w:rPr>
-        <w:t>, 122–44. London: Palgrave Macmillan UK.</w:t>
+        <w:t>, edited by Kathleen Loock and Constantine Verevis, 122–44. London: Palgrave Macmillan UK.</w:t>
       </w:r>
       <w:hyperlink r:id="rId12" w:history="1">
         <w:r>
@@ -5337,7 +5093,7 @@
 </file>
 
 <file path=word/endnotes.xml><?xml version="1.0" encoding="utf-8"?>
-<w:endnotes xmlns:wpc="http://schemas.microsoft.com/office/word/2010/wordprocessingCanvas" xmlns:cx="http://schemas.microsoft.com/office/drawing/2014/chartex" xmlns:cx1="http://schemas.microsoft.com/office/drawing/2015/9/8/chartex" xmlns:cx2="http://schemas.microsoft.com/office/drawing/2015/10/21/chartex" xmlns:cx3="http://schemas.microsoft.com/office/drawing/2016/5/9/chartex" xmlns:cx4="http://schemas.microsoft.com/office/drawing/2016/5/10/chartex" xmlns:cx5="http://schemas.microsoft.com/office/drawing/2016/5/11/chartex" xmlns:cx6="http://schemas.microsoft.com/office/drawing/2016/5/12/chartex" xmlns:cx7="http://schemas.microsoft.com/office/drawing/2016/5/13/chartex" xmlns:cx8="http://schemas.microsoft.com/office/drawing/2016/5/14/chartex" xmlns:mc="http://schemas.openxmlformats.org/markup-compatibility/2006" xmlns:aink="http://schemas.microsoft.com/office/drawing/2016/ink" xmlns:am3d="http://schemas.microsoft.com/office/drawing/2017/model3d" xmlns:o="urn:schemas-microsoft-com:office:office" xmlns:oel="http://schemas.microsoft.com/office/2019/extlst" xmlns:r="http://schemas.openxmlformats.org/officeDocument/2006/relationships" xmlns:m="http://schemas.openxmlformats.org/officeDocument/2006/math" xmlns:v="urn:schemas-microsoft-com:vml" xmlns:wp14="http://schemas.microsoft.com/office/word/2010/wordprocessingDrawing" xmlns:wp="http://schemas.openxmlformats.org/drawingml/2006/wordprocessingDrawing" xmlns:w10="urn:schemas-microsoft-com:office:word" xmlns:w="http://schemas.openxmlformats.org/wordprocessingml/2006/main" xmlns:w14="http://schemas.microsoft.com/office/word/2010/wordml" xmlns:w15="http://schemas.microsoft.com/office/word/2012/wordml" xmlns:w16cex="http://schemas.microsoft.com/office/word/2018/wordml/cex" xmlns:w16cid="http://schemas.microsoft.com/office/word/2016/wordml/cid" xmlns:w16="http://schemas.microsoft.com/office/word/2018/wordml" xmlns:w16du="http://schemas.microsoft.com/office/word/2023/wordml/word16du" xmlns:w16sdtdh="http://schemas.microsoft.com/office/word/2020/wordml/sdtdatahash" xmlns:w16se="http://schemas.microsoft.com/office/word/2015/wordml/symex" xmlns:wpg="http://schemas.microsoft.com/office/word/2010/wordprocessingGroup" xmlns:wpi="http://schemas.microsoft.com/office/word/2010/wordprocessingInk" xmlns:wne="http://schemas.microsoft.com/office/word/2006/wordml" xmlns:wps="http://schemas.microsoft.com/office/word/2010/wordprocessingShape" mc:Ignorable="w14 w15 w16se w16cid w16 w16cex w16sdtdh w16du wp14">
+<w:endnotes xmlns:wpc="http://schemas.microsoft.com/office/word/2010/wordprocessingCanvas" xmlns:cx="http://schemas.microsoft.com/office/drawing/2014/chartex" xmlns:cx1="http://schemas.microsoft.com/office/drawing/2015/9/8/chartex" xmlns:cx2="http://schemas.microsoft.com/office/drawing/2015/10/21/chartex" xmlns:cx3="http://schemas.microsoft.com/office/drawing/2016/5/9/chartex" xmlns:cx4="http://schemas.microsoft.com/office/drawing/2016/5/10/chartex" xmlns:cx5="http://schemas.microsoft.com/office/drawing/2016/5/11/chartex" xmlns:cx6="http://schemas.microsoft.com/office/drawing/2016/5/12/chartex" xmlns:cx7="http://schemas.microsoft.com/office/drawing/2016/5/13/chartex" xmlns:cx8="http://schemas.microsoft.com/office/drawing/2016/5/14/chartex" xmlns:mc="http://schemas.openxmlformats.org/markup-compatibility/2006" xmlns:aink="http://schemas.microsoft.com/office/drawing/2016/ink" xmlns:am3d="http://schemas.microsoft.com/office/drawing/2017/model3d" xmlns:o="urn:schemas-microsoft-com:office:office" xmlns:oel="http://schemas.microsoft.com/office/2019/extlst" xmlns:r="http://schemas.openxmlformats.org/officeDocument/2006/relationships" xmlns:m="http://schemas.openxmlformats.org/officeDocument/2006/math" xmlns:v="urn:schemas-microsoft-com:vml" xmlns:wp14="http://schemas.microsoft.com/office/word/2010/wordprocessingDrawing" xmlns:wp="http://schemas.openxmlformats.org/drawingml/2006/wordprocessingDrawing" xmlns:w10="urn:schemas-microsoft-com:office:word" xmlns:w="http://schemas.openxmlformats.org/wordprocessingml/2006/main" xmlns:w14="http://schemas.microsoft.com/office/word/2010/wordml" xmlns:w15="http://schemas.microsoft.com/office/word/2012/wordml" xmlns:w16cex="http://schemas.microsoft.com/office/word/2018/wordml/cex" xmlns:w16cid="http://schemas.microsoft.com/office/word/2016/wordml/cid" xmlns:w16="http://schemas.microsoft.com/office/word/2018/wordml" xmlns:w16du="http://schemas.microsoft.com/office/word/2023/wordml/word16du" xmlns:w16sdtdh="http://schemas.microsoft.com/office/word/2020/wordml/sdtdatahash" xmlns:w16sdtfl="http://schemas.microsoft.com/office/word/2024/wordml/sdtformatlock" xmlns:w16se="http://schemas.microsoft.com/office/word/2015/wordml/symex" xmlns:wpg="http://schemas.microsoft.com/office/word/2010/wordprocessingGroup" xmlns:wpi="http://schemas.microsoft.com/office/word/2010/wordprocessingInk" xmlns:wne="http://schemas.microsoft.com/office/word/2006/wordml" xmlns:wps="http://schemas.microsoft.com/office/word/2010/wordprocessingShape" mc:Ignorable="w14 w15 w16se w16cid w16 w16cex w16sdtdh w16sdtfl w16du wp14">
   <w:endnote w:type="separator" w:id="-1">
     <w:p>
       <w:r>
@@ -5356,7 +5112,7 @@
 </file>
 
 <file path=word/footer1.xml><?xml version="1.0" encoding="utf-8"?>
-<w:ftr xmlns:wpc="http://schemas.microsoft.com/office/word/2010/wordprocessingCanvas" xmlns:cx="http://schemas.microsoft.com/office/drawing/2014/chartex" xmlns:cx1="http://schemas.microsoft.com/office/drawing/2015/9/8/chartex" xmlns:cx2="http://schemas.microsoft.com/office/drawing/2015/10/21/chartex" xmlns:cx3="http://schemas.microsoft.com/office/drawing/2016/5/9/chartex" xmlns:cx4="http://schemas.microsoft.com/office/drawing/2016/5/10/chartex" xmlns:cx5="http://schemas.microsoft.com/office/drawing/2016/5/11/chartex" xmlns:cx6="http://schemas.microsoft.com/office/drawing/2016/5/12/chartex" xmlns:cx7="http://schemas.microsoft.com/office/drawing/2016/5/13/chartex" xmlns:cx8="http://schemas.microsoft.com/office/drawing/2016/5/14/chartex" xmlns:mc="http://schemas.openxmlformats.org/markup-compatibility/2006" xmlns:aink="http://schemas.microsoft.com/office/drawing/2016/ink" xmlns:am3d="http://schemas.microsoft.com/office/drawing/2017/model3d" xmlns:o="urn:schemas-microsoft-com:office:office" xmlns:oel="http://schemas.microsoft.com/office/2019/extlst" xmlns:r="http://schemas.openxmlformats.org/officeDocument/2006/relationships" xmlns:m="http://schemas.openxmlformats.org/officeDocument/2006/math" xmlns:v="urn:schemas-microsoft-com:vml" xmlns:wp14="http://schemas.microsoft.com/office/word/2010/wordprocessingDrawing" xmlns:wp="http://schemas.openxmlformats.org/drawingml/2006/wordprocessingDrawing" xmlns:w10="urn:schemas-microsoft-com:office:word" xmlns:w="http://schemas.openxmlformats.org/wordprocessingml/2006/main" xmlns:w14="http://schemas.microsoft.com/office/word/2010/wordml" xmlns:w15="http://schemas.microsoft.com/office/word/2012/wordml" xmlns:w16cex="http://schemas.microsoft.com/office/word/2018/wordml/cex" xmlns:w16cid="http://schemas.microsoft.com/office/word/2016/wordml/cid" xmlns:w16="http://schemas.microsoft.com/office/word/2018/wordml" xmlns:w16du="http://schemas.microsoft.com/office/word/2023/wordml/word16du" xmlns:w16sdtdh="http://schemas.microsoft.com/office/word/2020/wordml/sdtdatahash" xmlns:w16se="http://schemas.microsoft.com/office/word/2015/wordml/symex" xmlns:wpg="http://schemas.microsoft.com/office/word/2010/wordprocessingGroup" xmlns:wpi="http://schemas.microsoft.com/office/word/2010/wordprocessingInk" xmlns:wne="http://schemas.microsoft.com/office/word/2006/wordml" xmlns:wps="http://schemas.microsoft.com/office/word/2010/wordprocessingShape" mc:Ignorable="w14 w15 w16se w16cid w16 w16cex w16sdtdh w16du wp14">
+<w:ftr xmlns:wpc="http://schemas.microsoft.com/office/word/2010/wordprocessingCanvas" xmlns:cx="http://schemas.microsoft.com/office/drawing/2014/chartex" xmlns:cx1="http://schemas.microsoft.com/office/drawing/2015/9/8/chartex" xmlns:cx2="http://schemas.microsoft.com/office/drawing/2015/10/21/chartex" xmlns:cx3="http://schemas.microsoft.com/office/drawing/2016/5/9/chartex" xmlns:cx4="http://schemas.microsoft.com/office/drawing/2016/5/10/chartex" xmlns:cx5="http://schemas.microsoft.com/office/drawing/2016/5/11/chartex" xmlns:cx6="http://schemas.microsoft.com/office/drawing/2016/5/12/chartex" xmlns:cx7="http://schemas.microsoft.com/office/drawing/2016/5/13/chartex" xmlns:cx8="http://schemas.microsoft.com/office/drawing/2016/5/14/chartex" xmlns:mc="http://schemas.openxmlformats.org/markup-compatibility/2006" xmlns:aink="http://schemas.microsoft.com/office/drawing/2016/ink" xmlns:am3d="http://schemas.microsoft.com/office/drawing/2017/model3d" xmlns:o="urn:schemas-microsoft-com:office:office" xmlns:oel="http://schemas.microsoft.com/office/2019/extlst" xmlns:r="http://schemas.openxmlformats.org/officeDocument/2006/relationships" xmlns:m="http://schemas.openxmlformats.org/officeDocument/2006/math" xmlns:v="urn:schemas-microsoft-com:vml" xmlns:wp14="http://schemas.microsoft.com/office/word/2010/wordprocessingDrawing" xmlns:wp="http://schemas.openxmlformats.org/drawingml/2006/wordprocessingDrawing" xmlns:w10="urn:schemas-microsoft-com:office:word" xmlns:w="http://schemas.openxmlformats.org/wordprocessingml/2006/main" xmlns:w14="http://schemas.microsoft.com/office/word/2010/wordml" xmlns:w15="http://schemas.microsoft.com/office/word/2012/wordml" xmlns:w16cex="http://schemas.microsoft.com/office/word/2018/wordml/cex" xmlns:w16cid="http://schemas.microsoft.com/office/word/2016/wordml/cid" xmlns:w16="http://schemas.microsoft.com/office/word/2018/wordml" xmlns:w16du="http://schemas.microsoft.com/office/word/2023/wordml/word16du" xmlns:w16sdtdh="http://schemas.microsoft.com/office/word/2020/wordml/sdtdatahash" xmlns:w16sdtfl="http://schemas.microsoft.com/office/word/2024/wordml/sdtformatlock" xmlns:w16se="http://schemas.microsoft.com/office/word/2015/wordml/symex" xmlns:wpg="http://schemas.microsoft.com/office/word/2010/wordprocessingGroup" xmlns:wpi="http://schemas.microsoft.com/office/word/2010/wordprocessingInk" xmlns:wne="http://schemas.microsoft.com/office/word/2006/wordml" xmlns:wps="http://schemas.microsoft.com/office/word/2010/wordprocessingShape" mc:Ignorable="w14 w15 w16se w16cid w16 w16cex w16sdtdh w16sdtfl w16du wp14">
   <w:p>
     <w:pPr>
       <w:pStyle w:val="Footer"/>
@@ -5389,7 +5145,7 @@
 </file>
 
 <file path=word/footnotes.xml><?xml version="1.0" encoding="utf-8"?>
-<w:footnotes xmlns:wpc="http://schemas.microsoft.com/office/word/2010/wordprocessingCanvas" xmlns:cx="http://schemas.microsoft.com/office/drawing/2014/chartex" xmlns:cx1="http://schemas.microsoft.com/office/drawing/2015/9/8/chartex" xmlns:cx2="http://schemas.microsoft.com/office/drawing/2015/10/21/chartex" xmlns:cx3="http://schemas.microsoft.com/office/drawing/2016/5/9/chartex" xmlns:cx4="http://schemas.microsoft.com/office/drawing/2016/5/10/chartex" xmlns:cx5="http://schemas.microsoft.com/office/drawing/2016/5/11/chartex" xmlns:cx6="http://schemas.microsoft.com/office/drawing/2016/5/12/chartex" xmlns:cx7="http://schemas.microsoft.com/office/drawing/2016/5/13/chartex" xmlns:cx8="http://schemas.microsoft.com/office/drawing/2016/5/14/chartex" xmlns:mc="http://schemas.openxmlformats.org/markup-compatibility/2006" xmlns:aink="http://schemas.microsoft.com/office/drawing/2016/ink" xmlns:am3d="http://schemas.microsoft.com/office/drawing/2017/model3d" xmlns:o="urn:schemas-microsoft-com:office:office" xmlns:oel="http://schemas.microsoft.com/office/2019/extlst" xmlns:r="http://schemas.openxmlformats.org/officeDocument/2006/relationships" xmlns:m="http://schemas.openxmlformats.org/officeDocument/2006/math" xmlns:v="urn:schemas-microsoft-com:vml" xmlns:wp14="http://schemas.microsoft.com/office/word/2010/wordprocessingDrawing" xmlns:wp="http://schemas.openxmlformats.org/drawingml/2006/wordprocessingDrawing" xmlns:w10="urn:schemas-microsoft-com:office:word" xmlns:w="http://schemas.openxmlformats.org/wordprocessingml/2006/main" xmlns:w14="http://schemas.microsoft.com/office/word/2010/wordml" xmlns:w15="http://schemas.microsoft.com/office/word/2012/wordml" xmlns:w16cex="http://schemas.microsoft.com/office/word/2018/wordml/cex" xmlns:w16cid="http://schemas.microsoft.com/office/word/2016/wordml/cid" xmlns:w16="http://schemas.microsoft.com/office/word/2018/wordml" xmlns:w16du="http://schemas.microsoft.com/office/word/2023/wordml/word16du" xmlns:w16sdtdh="http://schemas.microsoft.com/office/word/2020/wordml/sdtdatahash" xmlns:w16se="http://schemas.microsoft.com/office/word/2015/wordml/symex" xmlns:wpg="http://schemas.microsoft.com/office/word/2010/wordprocessingGroup" xmlns:wpi="http://schemas.microsoft.com/office/word/2010/wordprocessingInk" xmlns:wne="http://schemas.microsoft.com/office/word/2006/wordml" xmlns:wps="http://schemas.microsoft.com/office/word/2010/wordprocessingShape" mc:Ignorable="w14 w15 w16se w16cid w16 w16cex w16sdtdh w16du wp14">
+<w:footnotes xmlns:wpc="http://schemas.microsoft.com/office/word/2010/wordprocessingCanvas" xmlns:cx="http://schemas.microsoft.com/office/drawing/2014/chartex" xmlns:cx1="http://schemas.microsoft.com/office/drawing/2015/9/8/chartex" xmlns:cx2="http://schemas.microsoft.com/office/drawing/2015/10/21/chartex" xmlns:cx3="http://schemas.microsoft.com/office/drawing/2016/5/9/chartex" xmlns:cx4="http://schemas.microsoft.com/office/drawing/2016/5/10/chartex" xmlns:cx5="http://schemas.microsoft.com/office/drawing/2016/5/11/chartex" xmlns:cx6="http://schemas.microsoft.com/office/drawing/2016/5/12/chartex" xmlns:cx7="http://schemas.microsoft.com/office/drawing/2016/5/13/chartex" xmlns:cx8="http://schemas.microsoft.com/office/drawing/2016/5/14/chartex" xmlns:mc="http://schemas.openxmlformats.org/markup-compatibility/2006" xmlns:aink="http://schemas.microsoft.com/office/drawing/2016/ink" xmlns:am3d="http://schemas.microsoft.com/office/drawing/2017/model3d" xmlns:o="urn:schemas-microsoft-com:office:office" xmlns:oel="http://schemas.microsoft.com/office/2019/extlst" xmlns:r="http://schemas.openxmlformats.org/officeDocument/2006/relationships" xmlns:m="http://schemas.openxmlformats.org/officeDocument/2006/math" xmlns:v="urn:schemas-microsoft-com:vml" xmlns:wp14="http://schemas.microsoft.com/office/word/2010/wordprocessingDrawing" xmlns:wp="http://schemas.openxmlformats.org/drawingml/2006/wordprocessingDrawing" xmlns:w10="urn:schemas-microsoft-com:office:word" xmlns:w="http://schemas.openxmlformats.org/wordprocessingml/2006/main" xmlns:w14="http://schemas.microsoft.com/office/word/2010/wordml" xmlns:w15="http://schemas.microsoft.com/office/word/2012/wordml" xmlns:w16cex="http://schemas.microsoft.com/office/word/2018/wordml/cex" xmlns:w16cid="http://schemas.microsoft.com/office/word/2016/wordml/cid" xmlns:w16="http://schemas.microsoft.com/office/word/2018/wordml" xmlns:w16du="http://schemas.microsoft.com/office/word/2023/wordml/word16du" xmlns:w16sdtdh="http://schemas.microsoft.com/office/word/2020/wordml/sdtdatahash" xmlns:w16sdtfl="http://schemas.microsoft.com/office/word/2024/wordml/sdtformatlock" xmlns:w16se="http://schemas.microsoft.com/office/word/2015/wordml/symex" xmlns:wpg="http://schemas.microsoft.com/office/word/2010/wordprocessingGroup" xmlns:wpi="http://schemas.microsoft.com/office/word/2010/wordprocessingInk" xmlns:wne="http://schemas.microsoft.com/office/word/2006/wordml" xmlns:wps="http://schemas.microsoft.com/office/word/2010/wordprocessingShape" mc:Ignorable="w14 w15 w16se w16cid w16 w16cex w16sdtdh w16sdtfl w16du wp14">
   <w:footnote w:type="separator" w:id="-1">
     <w:p>
       <w:r>
@@ -5408,7 +5164,7 @@
 </file>
 
 <file path=word/header1.xml><?xml version="1.0" encoding="utf-8"?>
-<w:hdr xmlns:wpc="http://schemas.microsoft.com/office/word/2010/wordprocessingCanvas" xmlns:cx="http://schemas.microsoft.com/office/drawing/2014/chartex" xmlns:cx1="http://schemas.microsoft.com/office/drawing/2015/9/8/chartex" xmlns:cx2="http://schemas.microsoft.com/office/drawing/2015/10/21/chartex" xmlns:cx3="http://schemas.microsoft.com/office/drawing/2016/5/9/chartex" xmlns:cx4="http://schemas.microsoft.com/office/drawing/2016/5/10/chartex" xmlns:cx5="http://schemas.microsoft.com/office/drawing/2016/5/11/chartex" xmlns:cx6="http://schemas.microsoft.com/office/drawing/2016/5/12/chartex" xmlns:cx7="http://schemas.microsoft.com/office/drawing/2016/5/13/chartex" xmlns:cx8="http://schemas.microsoft.com/office/drawing/2016/5/14/chartex" xmlns:mc="http://schemas.openxmlformats.org/markup-compatibility/2006" xmlns:aink="http://schemas.microsoft.com/office/drawing/2016/ink" xmlns:am3d="http://schemas.microsoft.com/office/drawing/2017/model3d" xmlns:o="urn:schemas-microsoft-com:office:office" xmlns:oel="http://schemas.microsoft.com/office/2019/extlst" xmlns:r="http://schemas.openxmlformats.org/officeDocument/2006/relationships" xmlns:m="http://schemas.openxmlformats.org/officeDocument/2006/math" xmlns:v="urn:schemas-microsoft-com:vml" xmlns:wp14="http://schemas.microsoft.com/office/word/2010/wordprocessingDrawing" xmlns:wp="http://schemas.openxmlformats.org/drawingml/2006/wordprocessingDrawing" xmlns:w10="urn:schemas-microsoft-com:office:word" xmlns:w="http://schemas.openxmlformats.org/wordprocessingml/2006/main" xmlns:w14="http://schemas.microsoft.com/office/word/2010/wordml" xmlns:w15="http://schemas.microsoft.com/office/word/2012/wordml" xmlns:w16cex="http://schemas.microsoft.com/office/word/2018/wordml/cex" xmlns:w16cid="http://schemas.microsoft.com/office/word/2016/wordml/cid" xmlns:w16="http://schemas.microsoft.com/office/word/2018/wordml" xmlns:w16du="http://schemas.microsoft.com/office/word/2023/wordml/word16du" xmlns:w16sdtdh="http://schemas.microsoft.com/office/word/2020/wordml/sdtdatahash" xmlns:w16se="http://schemas.microsoft.com/office/word/2015/wordml/symex" xmlns:wpg="http://schemas.microsoft.com/office/word/2010/wordprocessingGroup" xmlns:wpi="http://schemas.microsoft.com/office/word/2010/wordprocessingInk" xmlns:wne="http://schemas.microsoft.com/office/word/2006/wordml" xmlns:wps="http://schemas.microsoft.com/office/word/2010/wordprocessingShape" mc:Ignorable="w14 w15 w16se w16cid w16 w16cex w16sdtdh w16du wp14">
+<w:hdr xmlns:wpc="http://schemas.microsoft.com/office/word/2010/wordprocessingCanvas" xmlns:cx="http://schemas.microsoft.com/office/drawing/2014/chartex" xmlns:cx1="http://schemas.microsoft.com/office/drawing/2015/9/8/chartex" xmlns:cx2="http://schemas.microsoft.com/office/drawing/2015/10/21/chartex" xmlns:cx3="http://schemas.microsoft.com/office/drawing/2016/5/9/chartex" xmlns:cx4="http://schemas.microsoft.com/office/drawing/2016/5/10/chartex" xmlns:cx5="http://schemas.microsoft.com/office/drawing/2016/5/11/chartex" xmlns:cx6="http://schemas.microsoft.com/office/drawing/2016/5/12/chartex" xmlns:cx7="http://schemas.microsoft.com/office/drawing/2016/5/13/chartex" xmlns:cx8="http://schemas.microsoft.com/office/drawing/2016/5/14/chartex" xmlns:mc="http://schemas.openxmlformats.org/markup-compatibility/2006" xmlns:aink="http://schemas.microsoft.com/office/drawing/2016/ink" xmlns:am3d="http://schemas.microsoft.com/office/drawing/2017/model3d" xmlns:o="urn:schemas-microsoft-com:office:office" xmlns:oel="http://schemas.microsoft.com/office/2019/extlst" xmlns:r="http://schemas.openxmlformats.org/officeDocument/2006/relationships" xmlns:m="http://schemas.openxmlformats.org/officeDocument/2006/math" xmlns:v="urn:schemas-microsoft-com:vml" xmlns:wp14="http://schemas.microsoft.com/office/word/2010/wordprocessingDrawing" xmlns:wp="http://schemas.openxmlformats.org/drawingml/2006/wordprocessingDrawing" xmlns:w10="urn:schemas-microsoft-com:office:word" xmlns:w="http://schemas.openxmlformats.org/wordprocessingml/2006/main" xmlns:w14="http://schemas.microsoft.com/office/word/2010/wordml" xmlns:w15="http://schemas.microsoft.com/office/word/2012/wordml" xmlns:w16cex="http://schemas.microsoft.com/office/word/2018/wordml/cex" xmlns:w16cid="http://schemas.microsoft.com/office/word/2016/wordml/cid" xmlns:w16="http://schemas.microsoft.com/office/word/2018/wordml" xmlns:w16du="http://schemas.microsoft.com/office/word/2023/wordml/word16du" xmlns:w16sdtdh="http://schemas.microsoft.com/office/word/2020/wordml/sdtdatahash" xmlns:w16sdtfl="http://schemas.microsoft.com/office/word/2024/wordml/sdtformatlock" xmlns:w16se="http://schemas.microsoft.com/office/word/2015/wordml/symex" xmlns:wpg="http://schemas.microsoft.com/office/word/2010/wordprocessingGroup" xmlns:wpi="http://schemas.microsoft.com/office/word/2010/wordprocessingInk" xmlns:wne="http://schemas.microsoft.com/office/word/2006/wordml" xmlns:wps="http://schemas.microsoft.com/office/word/2010/wordprocessingShape" mc:Ignorable="w14 w15 w16se w16cid w16 w16cex w16sdtdh w16sdtfl w16du wp14">
   <w:p>
     <w:pPr>
       <w:pStyle w:val="HeaderFooter"/>
@@ -5418,7 +5174,7 @@
 </file>
 
 <file path=word/numbering.xml><?xml version="1.0" encoding="utf-8"?>
-<w:numbering xmlns:wpc="http://schemas.microsoft.com/office/word/2010/wordprocessingCanvas" xmlns:cx="http://schemas.microsoft.com/office/drawing/2014/chartex" xmlns:cx1="http://schemas.microsoft.com/office/drawing/2015/9/8/chartex" xmlns:cx2="http://schemas.microsoft.com/office/drawing/2015/10/21/chartex" xmlns:cx3="http://schemas.microsoft.com/office/drawing/2016/5/9/chartex" xmlns:cx4="http://schemas.microsoft.com/office/drawing/2016/5/10/chartex" xmlns:cx5="http://schemas.microsoft.com/office/drawing/2016/5/11/chartex" xmlns:cx6="http://schemas.microsoft.com/office/drawing/2016/5/12/chartex" xmlns:cx7="http://schemas.microsoft.com/office/drawing/2016/5/13/chartex" xmlns:cx8="http://schemas.microsoft.com/office/drawing/2016/5/14/chartex" xmlns:mc="http://schemas.openxmlformats.org/markup-compatibility/2006" xmlns:aink="http://schemas.microsoft.com/office/drawing/2016/ink" xmlns:am3d="http://schemas.microsoft.com/office/drawing/2017/model3d" xmlns:o="urn:schemas-microsoft-com:office:office" xmlns:oel="http://schemas.microsoft.com/office/2019/extlst" xmlns:r="http://schemas.openxmlformats.org/officeDocument/2006/relationships" xmlns:m="http://schemas.openxmlformats.org/officeDocument/2006/math" xmlns:v="urn:schemas-microsoft-com:vml" xmlns:wp14="http://schemas.microsoft.com/office/word/2010/wordprocessingDrawing" xmlns:wp="http://schemas.openxmlformats.org/drawingml/2006/wordprocessingDrawing" xmlns:w10="urn:schemas-microsoft-com:office:word" xmlns:w="http://schemas.openxmlformats.org/wordprocessingml/2006/main" xmlns:w14="http://schemas.microsoft.com/office/word/2010/wordml" xmlns:w15="http://schemas.microsoft.com/office/word/2012/wordml" xmlns:w16cex="http://schemas.microsoft.com/office/word/2018/wordml/cex" xmlns:w16cid="http://schemas.microsoft.com/office/word/2016/wordml/cid" xmlns:w16="http://schemas.microsoft.com/office/word/2018/wordml" xmlns:w16du="http://schemas.microsoft.com/office/word/2023/wordml/word16du" xmlns:w16sdtdh="http://schemas.microsoft.com/office/word/2020/wordml/sdtdatahash" xmlns:w16se="http://schemas.microsoft.com/office/word/2015/wordml/symex" xmlns:wpg="http://schemas.microsoft.com/office/word/2010/wordprocessingGroup" xmlns:wpi="http://schemas.microsoft.com/office/word/2010/wordprocessingInk" xmlns:wne="http://schemas.microsoft.com/office/word/2006/wordml" xmlns:wps="http://schemas.microsoft.com/office/word/2010/wordprocessingShape" mc:Ignorable="w14 w15 w16se w16cid w16 w16cex w16sdtdh w16du wp14">
+<w:numbering xmlns:wpc="http://schemas.microsoft.com/office/word/2010/wordprocessingCanvas" xmlns:cx="http://schemas.microsoft.com/office/drawing/2014/chartex" xmlns:cx1="http://schemas.microsoft.com/office/drawing/2015/9/8/chartex" xmlns:cx2="http://schemas.microsoft.com/office/drawing/2015/10/21/chartex" xmlns:cx3="http://schemas.microsoft.com/office/drawing/2016/5/9/chartex" xmlns:cx4="http://schemas.microsoft.com/office/drawing/2016/5/10/chartex" xmlns:cx5="http://schemas.microsoft.com/office/drawing/2016/5/11/chartex" xmlns:cx6="http://schemas.microsoft.com/office/drawing/2016/5/12/chartex" xmlns:cx7="http://schemas.microsoft.com/office/drawing/2016/5/13/chartex" xmlns:cx8="http://schemas.microsoft.com/office/drawing/2016/5/14/chartex" xmlns:mc="http://schemas.openxmlformats.org/markup-compatibility/2006" xmlns:aink="http://schemas.microsoft.com/office/drawing/2016/ink" xmlns:am3d="http://schemas.microsoft.com/office/drawing/2017/model3d" xmlns:o="urn:schemas-microsoft-com:office:office" xmlns:oel="http://schemas.microsoft.com/office/2019/extlst" xmlns:r="http://schemas.openxmlformats.org/officeDocument/2006/relationships" xmlns:m="http://schemas.openxmlformats.org/officeDocument/2006/math" xmlns:v="urn:schemas-microsoft-com:vml" xmlns:wp14="http://schemas.microsoft.com/office/word/2010/wordprocessingDrawing" xmlns:wp="http://schemas.openxmlformats.org/drawingml/2006/wordprocessingDrawing" xmlns:w10="urn:schemas-microsoft-com:office:word" xmlns:w="http://schemas.openxmlformats.org/wordprocessingml/2006/main" xmlns:w14="http://schemas.microsoft.com/office/word/2010/wordml" xmlns:w15="http://schemas.microsoft.com/office/word/2012/wordml" xmlns:w16cex="http://schemas.microsoft.com/office/word/2018/wordml/cex" xmlns:w16cid="http://schemas.microsoft.com/office/word/2016/wordml/cid" xmlns:w16="http://schemas.microsoft.com/office/word/2018/wordml" xmlns:w16du="http://schemas.microsoft.com/office/word/2023/wordml/word16du" xmlns:w16sdtdh="http://schemas.microsoft.com/office/word/2020/wordml/sdtdatahash" xmlns:w16sdtfl="http://schemas.microsoft.com/office/word/2024/wordml/sdtformatlock" xmlns:w16se="http://schemas.microsoft.com/office/word/2015/wordml/symex" xmlns:wpg="http://schemas.microsoft.com/office/word/2010/wordprocessingGroup" xmlns:wpi="http://schemas.microsoft.com/office/word/2010/wordprocessingInk" xmlns:wne="http://schemas.microsoft.com/office/word/2006/wordml" xmlns:wps="http://schemas.microsoft.com/office/word/2010/wordprocessingShape" mc:Ignorable="w14 w15 w16se w16cid w16 w16cex w16sdtdh w16sdtfl w16du wp14">
   <w:abstractNum w:abstractNumId="0" w15:restartNumberingAfterBreak="0">
     <w:nsid w:val="46557514"/>
     <w:multiLevelType w:val="hybridMultilevel"/>
@@ -5702,7 +5458,7 @@
 </file>
 
 <file path=word/styles.xml><?xml version="1.0" encoding="utf-8"?>
-<w:styles xmlns:mc="http://schemas.openxmlformats.org/markup-compatibility/2006" xmlns:r="http://schemas.openxmlformats.org/officeDocument/2006/relationships" xmlns:w="http://schemas.openxmlformats.org/wordprocessingml/2006/main" xmlns:w14="http://schemas.microsoft.com/office/word/2010/wordml" xmlns:w15="http://schemas.microsoft.com/office/word/2012/wordml" xmlns:w16cex="http://schemas.microsoft.com/office/word/2018/wordml/cex" xmlns:w16cid="http://schemas.microsoft.com/office/word/2016/wordml/cid" xmlns:w16="http://schemas.microsoft.com/office/word/2018/wordml" xmlns:w16du="http://schemas.microsoft.com/office/word/2023/wordml/word16du" xmlns:w16sdtdh="http://schemas.microsoft.com/office/word/2020/wordml/sdtdatahash" xmlns:w16se="http://schemas.microsoft.com/office/word/2015/wordml/symex" mc:Ignorable="w14 w15 w16se w16cid w16 w16cex w16sdtdh w16du">
+<w:styles xmlns:mc="http://schemas.openxmlformats.org/markup-compatibility/2006" xmlns:r="http://schemas.openxmlformats.org/officeDocument/2006/relationships" xmlns:w="http://schemas.openxmlformats.org/wordprocessingml/2006/main" xmlns:w14="http://schemas.microsoft.com/office/word/2010/wordml" xmlns:w15="http://schemas.microsoft.com/office/word/2012/wordml" xmlns:w16cex="http://schemas.microsoft.com/office/word/2018/wordml/cex" xmlns:w16cid="http://schemas.microsoft.com/office/word/2016/wordml/cid" xmlns:w16="http://schemas.microsoft.com/office/word/2018/wordml" xmlns:w16du="http://schemas.microsoft.com/office/word/2023/wordml/word16du" xmlns:w16sdtdh="http://schemas.microsoft.com/office/word/2020/wordml/sdtdatahash" xmlns:w16sdtfl="http://schemas.microsoft.com/office/word/2024/wordml/sdtformatlock" xmlns:w16se="http://schemas.microsoft.com/office/word/2015/wordml/symex" mc:Ignorable="w14 w15 w16se w16cid w16 w16cex w16sdtdh w16sdtfl w16du">
   <w:docDefaults>
     <w:rPrDefault>
       <w:rPr>

</xml_diff>